<commit_message>
added last updated date
</commit_message>
<xml_diff>
--- a/templates/capstone_faculty_mentor_briefing_template.docx
+++ b/templates/capstone_faculty_mentor_briefing_template.docx
@@ -87,31 +87,45 @@
           <w:sz w:val="28"/>
           <w:szCs w:val="28"/>
         </w:rPr>
-        <w:t xml:space="preserve">Capstone Faculty Mentor Briefing </w:t>
-      </w:r>
-      <w:r>
-        <w:rPr>
-          <w:sz w:val="28"/>
-          <w:szCs w:val="28"/>
-        </w:rPr>
-        <w:t>Report</w:t>
-      </w:r>
-      <w:r>
-        <w:rPr>
-          <w:sz w:val="28"/>
-          <w:szCs w:val="28"/>
-        </w:rPr>
-        <w:t xml:space="preserve"> Template</w:t>
-      </w:r>
-    </w:p>
-    <w:p>
-      <w:pPr>
-        <w:pStyle w:val="Normal"/>
-        <w:rPr/>
-      </w:pPr>
-      <w:r>
-        <w:rPr/>
-        <w:t>Last updated: July 14, 2025</w:t>
+        <w:t>Capstone Faculty Mentor Briefing Report Template</w:t>
+      </w:r>
+    </w:p>
+    <w:p>
+      <w:pPr>
+        <w:pStyle w:val="Normal"/>
+        <w:rPr/>
+      </w:pPr>
+      <w:r>
+        <w:rPr/>
+        <w:t>Report l</w:t>
+      </w:r>
+      <w:r>
+        <w:rPr/>
+        <w:t xml:space="preserve">ast updated: </w:t>
+      </w:r>
+      <w:r>
+        <w:rPr>
+          <w:b w:val="false"/>
+          <w:bCs w:val="false"/>
+        </w:rPr>
+        <w:t>[</w:t>
+      </w:r>
+      <w:r>
+        <w:rPr>
+          <w:b w:val="false"/>
+          <w:bCs w:val="false"/>
+        </w:rPr>
+        <w:t>students to provide date</w:t>
+      </w:r>
+      <w:r>
+        <w:rPr>
+          <w:b w:val="false"/>
+          <w:bCs w:val="false"/>
+        </w:rPr>
+        <w:t>]</w:t>
+      </w:r>
+      <w:r>
+        <w:rPr/>
         <w:br/>
       </w:r>
     </w:p>

</xml_diff>

<commit_message>
added instructions to share with capstone director
</commit_message>
<xml_diff>
--- a/templates/capstone_faculty_mentor_briefing_template.docx
+++ b/templates/capstone_faculty_mentor_briefing_template.docx
@@ -130,7 +130,15 @@
         <w:t>The purpose of this document is to summarize progress made over the previous term so the faculty mentor can get caught up quickly. Activities last term should have included at least 1-2 meetings with the sponsor to initiate relevant onboarding and training, discovery, obtaining access to data, and a brief data review. Things may change over the course of capstone, and this information can evolve. The information can also be carried forward to the Progress Reports submitted later.</w:t>
         <w:br/>
         <w:br/>
-        <w:t xml:space="preserve">This document is to be emailed to the faculty mentor in the first week of the capstone course. It will be graded according to the rubric below </w:t>
+        <w:t xml:space="preserve">This document is to be emailed to the faculty mentor </w:t>
+      </w:r>
+      <w:r>
+        <w:rPr/>
+        <w:t>and capstone director</w:t>
+      </w:r>
+      <w:r>
+        <w:rPr/>
+        <w:t xml:space="preserve"> in the first week of the capstone course. It will be graded according to the rubric below </w:t>
       </w:r>
       <w:r>
         <w:rPr>
@@ -700,35 +708,7 @@
           <w:b/>
           <w:bCs/>
         </w:rPr>
-        <w:t xml:space="preserve">Did some subset of the student team meet with the sponsor? If so, briefly summarize the discussion. </w:t>
-      </w:r>
-      <w:r>
-        <w:rPr>
-          <w:b/>
-          <w:bCs/>
-        </w:rPr>
-        <w:t>I</w:t>
-      </w:r>
-      <w:r>
-        <w:rPr>
-          <w:b/>
-          <w:bCs/>
-        </w:rPr>
-        <w:t xml:space="preserve">nclude </w:t>
-      </w:r>
-      <w:r>
-        <w:rPr>
-          <w:b/>
-          <w:bCs/>
-        </w:rPr>
-        <w:t>at a minimum to the best of your ability</w:t>
-      </w:r>
-      <w:r>
-        <w:rPr>
-          <w:b/>
-          <w:bCs/>
-        </w:rPr>
-        <w:t>:</w:t>
+        <w:t>Did some subset of the student team meet with the sponsor? If so, briefly summarize the discussion. Include at a minimum to the best of your ability:</w:t>
         <w:br/>
       </w:r>
       <w:r>
@@ -766,14 +746,7 @@
       <w:r>
         <w:rPr/>
         <w:br/>
-        <w:t xml:space="preserve">- </w:t>
-      </w:r>
-      <w:r>
-        <w:rPr/>
-        <w:t>Anything that is unclear about the problem</w:t>
-      </w:r>
-      <w:r>
-        <w:rPr/>
+        <w:t>- Anything that is unclear about the problem</w:t>
         <w:br/>
       </w:r>
       <w:r>
@@ -1086,7 +1059,21 @@
           <w:b/>
           <w:bCs/>
         </w:rPr>
-        <w:t>Anything else you would like to share with the faculty mentor?</w:t>
+        <w:t xml:space="preserve">Anything else you would like to share with the faculty mentor </w:t>
+      </w:r>
+      <w:r>
+        <w:rPr>
+          <w:b/>
+          <w:bCs/>
+        </w:rPr>
+        <w:t>and capstone director</w:t>
+      </w:r>
+      <w:r>
+        <w:rPr>
+          <w:b/>
+          <w:bCs/>
+        </w:rPr>
+        <w:t>?</w:t>
       </w:r>
     </w:p>
     <w:p>

</xml_diff>